<commit_message>
Agregar diagrama de clases renderizado a la documentacion
Inserta la Fig. 2.1 (diagrama UML de las 10 clases con asociaciones y
dependencias) en la seccion 2. El codigo Mermaid queda en el Anexo B.
Ajusta 6.3 y 9: la via de mejora es ampliar el elenco, no sumar el
genero al pool del Greedy.

Co-Authored-By: Claude Sonnet 5 <noreply@anthropic.com>
Claude-Session: https://claude.ai/code/session_01BKdmpVYJxDXSxYg2BnRWAG
</commit_message>
<xml_diff>
--- a/Documentacion-Tecnica-TP-AdivinaQuien.docx
+++ b/Documentacion-Tecnica-TP-AdivinaQuien.docx
@@ -158,6 +158,58 @@
       </w:pPr>
       <w:r>
         <w:t>2. Diagrama de clases (UML)</w:t>
+      </w:r>
+    </w:p>
+    <w:p>
+      <w:pPr>
+        <w:jc w:val="center"/>
+      </w:pPr>
+      <w:r>
+        <w:drawing>
+          <wp:inline xmlns:a="http://schemas.openxmlformats.org/drawingml/2006/main" xmlns:pic="http://schemas.openxmlformats.org/drawingml/2006/picture">
+            <wp:extent cx="5220000" cy="6005663"/>
+            <wp:docPr id="1" name="Picture 1"/>
+            <wp:cNvGraphicFramePr>
+              <a:graphicFrameLocks noChangeAspect="1"/>
+            </wp:cNvGraphicFramePr>
+            <a:graphic>
+              <a:graphicData uri="http://schemas.openxmlformats.org/drawingml/2006/picture">
+                <pic:pic>
+                  <pic:nvPicPr>
+                    <pic:cNvPr id="0" name="diagrama.png"/>
+                    <pic:cNvPicPr/>
+                  </pic:nvPicPr>
+                  <pic:blipFill>
+                    <a:blip r:embed="rId10"/>
+                    <a:stretch>
+                      <a:fillRect/>
+                    </a:stretch>
+                  </pic:blipFill>
+                  <pic:spPr>
+                    <a:xfrm>
+                      <a:off x="0" y="0"/>
+                      <a:ext cx="5220000" cy="6005663"/>
+                    </a:xfrm>
+                    <a:prstGeom prst="rect"/>
+                  </pic:spPr>
+                </pic:pic>
+              </a:graphicData>
+            </a:graphic>
+          </wp:inline>
+        </w:drawing>
+      </w:r>
+    </w:p>
+    <w:p>
+      <w:pPr>
+        <w:spacing w:after="200"/>
+      </w:pPr>
+      <w:r>
+        <w:rPr>
+          <w:i/>
+          <w:color w:val="555555"/>
+          <w:sz w:val="17"/>
+        </w:rPr>
+        <w:t>Fig. 2.1 — Diagrama de clases. Flecha llena: asociación (la clase mantiene el otro objeto como campo). Flecha punteada: dependencia (lo usa como parámetro o lo crea sin guardarlo). No hay herencia. Código fuente reproducible en el Anexo B.</w:t>
       </w:r>
     </w:p>
     <w:p>
@@ -694,7 +746,7 @@
         <w:rPr>
           <w:b w:val="0"/>
         </w:rPr>
-        <w:t>El diagrama de clases completo (notación UML) se adjunta como captura en el Anexo B; su código fuente reproducible está en el Anexo B para regenerarlo. Relaciones principales:</w:t>
+        <w:t>Detalle de las relaciones que aparecen en la Fig. 2.1:</w:t>
       </w:r>
     </w:p>
     <w:tbl>
@@ -4481,7 +4533,7 @@
         <w:rPr>
           <w:b w:val="0"/>
         </w:rPr>
-        <w:t>Pegar este bloque en mermaid.live (o en un plugin Mermaid del IDE) y adjuntar la captura resultante. Las capturas de pantalla no cuentan para el límite de páginas.</w:t>
+        <w:t>El diagrama renderizado está en la Fig. 2.1. Este es su código fuente, por si hay que regenerarlo o modificarlo: pegar el bloque en mermaid.live o en un plugin Mermaid del IDE.</w:t>
       </w:r>
     </w:p>
     <w:p>

</xml_diff>